<commit_message>
Convert the paper's lists to running prose
Author preference: the article carries no bulleted or numbered lists. The
three list environments are rewritten as paragraphs, namely the five
contributions in the introduction, the three hypotheses in Section 2.5,
and the four coding rules in Section 3.3. Bold inline labels keep H1, H2
and H3 findable without an environment.

The colon that introduced the contributions list is gone with it, and the
state-controlled rule no longer leans on an "X, not Y" construction.

Paper rebuilt to 10 pages and the .docx regenerated; neither now contains
a list.

Co-Authored-By: Claude Opus 5 <noreply@anthropic.com>
</commit_message>
<xml_diff>
--- a/paper/main.docx
+++ b/paper/main.docx
@@ -463,22 +463,17 @@
         <w:t xml:space="preserve"> </w:t>
       </w:r>
       <w:r>
-        <w:t xml:space="preserve">measurement for a bounded window. Our contributions:</w:t>
-      </w:r>
-    </w:p>
-    <w:p>
-      <w:pPr>
-        <w:numPr>
-          <w:ilvl w:val="0"/>
-          <w:numId w:val="1001"/>
-        </w:numPr>
-      </w:pPr>
+        <w:t xml:space="preserve">measurement for a bounded window, and makes five contributions. The first is a</w:t>
+      </w:r>
+      <w:r>
+        <w:t xml:space="preserve"> </w:t>
+      </w:r>
       <w:r>
         <w:rPr>
           <w:b/>
           <w:bCs/>
         </w:rPr>
-        <w:t xml:space="preserve">A citation-level audit</w:t>
+        <w:t xml:space="preserve">citation-level audit</w:t>
       </w:r>
       <w:r>
         <w:t xml:space="preserve"> </w:t>
@@ -490,109 +485,116 @@
         <w:t xml:space="preserve">,</w:t>
       </w:r>
       <w:r>
-        <w:t xml:space="preserve">078 citation events with</w:t>
-      </w:r>
-      <w:r>
-        <w:t xml:space="preserve"> </w:t>
-      </w:r>
-      <w:r>
-        <w:t xml:space="preserve">proportions as Wilson score intervals, showing news of any kind at 12.8%.</w:t>
-      </w:r>
-    </w:p>
-    <w:p>
-      <w:pPr>
-        <w:numPr>
-          <w:ilvl w:val="0"/>
-          <w:numId w:val="1001"/>
-        </w:numPr>
-      </w:pPr>
+        <w:t xml:space="preserve">078 citation events, with proportions</w:t>
+      </w:r>
+      <w:r>
+        <w:t xml:space="preserve"> </w:t>
+      </w:r>
+      <w:r>
+        <w:t xml:space="preserve">reported as Wilson score intervals, which places news of any kind at 12.8% of</w:t>
+      </w:r>
+      <w:r>
+        <w:t xml:space="preserve"> </w:t>
+      </w:r>
+      <w:r>
+        <w:t xml:space="preserve">the total. The second is a</w:t>
+      </w:r>
+      <w:r>
+        <w:t xml:space="preserve"> </w:t>
+      </w:r>
       <w:r>
         <w:rPr>
           <w:b/>
           <w:bCs/>
         </w:rPr>
-        <w:t xml:space="preserve">A concentration analysis</w:t>
-      </w:r>
-      <w:r>
-        <w:t xml:space="preserve"> </w:t>
-      </w:r>
-      <w:r>
-        <w:t xml:space="preserve">quantifying how narrow the diet is.</w:t>
-      </w:r>
-    </w:p>
-    <w:p>
-      <w:pPr>
-        <w:numPr>
-          <w:ilvl w:val="0"/>
-          <w:numId w:val="1001"/>
-        </w:numPr>
-      </w:pPr>
+        <w:t xml:space="preserve">concentration analysis</w:t>
+      </w:r>
+      <w:r>
+        <w:t xml:space="preserve"> </w:t>
+      </w:r>
+      <w:r>
+        <w:t xml:space="preserve">quantifying how</w:t>
+      </w:r>
+      <w:r>
+        <w:t xml:space="preserve"> </w:t>
+      </w:r>
+      <w:r>
+        <w:t xml:space="preserve">narrow the resulting diet is. The third is a</w:t>
+      </w:r>
+      <w:r>
+        <w:t xml:space="preserve"> </w:t>
+      </w:r>
       <w:r>
         <w:rPr>
           <w:b/>
           <w:bCs/>
         </w:rPr>
-        <w:t xml:space="preserve">A structural test</w:t>
-      </w:r>
-      <w:r>
-        <w:t xml:space="preserve"> </w:t>
-      </w:r>
-      <w:r>
-        <w:t xml:space="preserve">of the counter-canon claim: co-citation</w:t>
-      </w:r>
-      <w:r>
-        <w:t xml:space="preserve"> </w:t>
-      </w:r>
-      <w:r>
-        <w:t xml:space="preserve">assortativity by editorial orientation, which finds none.</w:t>
-      </w:r>
-    </w:p>
-    <w:p>
-      <w:pPr>
-        <w:numPr>
-          <w:ilvl w:val="0"/>
-          <w:numId w:val="1001"/>
-        </w:numPr>
-      </w:pPr>
+        <w:t xml:space="preserve">structural test</w:t>
+      </w:r>
+      <w:r>
+        <w:t xml:space="preserve"> </w:t>
+      </w:r>
+      <w:r>
+        <w:t xml:space="preserve">of the</w:t>
+      </w:r>
+      <w:r>
+        <w:t xml:space="preserve"> </w:t>
+      </w:r>
+      <w:r>
+        <w:t xml:space="preserve">counter-canon claim, measuring co-citation assortativity by editorial</w:t>
+      </w:r>
+      <w:r>
+        <w:t xml:space="preserve"> </w:t>
+      </w:r>
+      <w:r>
+        <w:t xml:space="preserve">orientation, which finds none. The fourth is a</w:t>
+      </w:r>
+      <w:r>
+        <w:t xml:space="preserve"> </w:t>
+      </w:r>
       <w:r>
         <w:rPr>
           <w:b/>
           <w:bCs/>
         </w:rPr>
-        <w:t xml:space="preserve">A published codebook</w:t>
-      </w:r>
-      <w:r>
-        <w:t xml:space="preserve"> </w:t>
-      </w:r>
-      <w:r>
-        <w:t xml:space="preserve">of 203 manually coded domains, and evidence</w:t>
-      </w:r>
-      <w:r>
-        <w:t xml:space="preserve"> </w:t>
-      </w:r>
-      <w:r>
-        <w:t xml:space="preserve">that US-centric source taxonomies undercount news 2.8-fold here.</w:t>
-      </w:r>
-    </w:p>
-    <w:p>
-      <w:pPr>
-        <w:numPr>
-          <w:ilvl w:val="0"/>
-          <w:numId w:val="1001"/>
-        </w:numPr>
-      </w:pPr>
+        <w:t xml:space="preserve">published codebook</w:t>
+      </w:r>
+      <w:r>
+        <w:t xml:space="preserve"> </w:t>
+      </w:r>
+      <w:r>
+        <w:t xml:space="preserve">of</w:t>
+      </w:r>
+      <w:r>
+        <w:t xml:space="preserve"> </w:t>
+      </w:r>
+      <w:r>
+        <w:t xml:space="preserve">203 manually coded domains, together with evidence that US-centric source</w:t>
+      </w:r>
+      <w:r>
+        <w:t xml:space="preserve"> </w:t>
+      </w:r>
+      <w:r>
+        <w:t xml:space="preserve">taxonomies undercount news on this corpus by a factor of 2.8. The fifth is a</w:t>
+      </w:r>
+      <w:r>
+        <w:t xml:space="preserve"> </w:t>
+      </w:r>
       <w:r>
         <w:rPr>
           <w:b/>
           <w:bCs/>
         </w:rPr>
-        <w:t xml:space="preserve">A measured floor on survivorship bias</w:t>
-      </w:r>
-      <w:r>
-        <w:t xml:space="preserve"> </w:t>
-      </w:r>
-      <w:r>
-        <w:t xml:space="preserve">from repeated captures.</w:t>
+        <w:t xml:space="preserve">measured floor on survivorship bias</w:t>
+      </w:r>
+      <w:r>
+        <w:t xml:space="preserve">, derived from repeated captures of</w:t>
+      </w:r>
+      <w:r>
+        <w:t xml:space="preserve"> </w:t>
+      </w:r>
+      <w:r>
+        <w:t xml:space="preserve">the same threads.</w:t>
       </w:r>
     </w:p>
     <w:bookmarkEnd w:id="11"/>
@@ -1230,34 +1232,32 @@
     </w:p>
     <w:p>
       <w:pPr>
-        <w:pStyle w:val="DefinitionTerm"/>
+        <w:pStyle w:val="BodyText"/>
       </w:pPr>
       <w:r>
         <w:rPr>
           <w:b/>
           <w:bCs/>
         </w:rPr>
-        <w:t xml:space="preserve">H1 (counter-canon).</w:t>
-      </w:r>
-    </w:p>
-    <w:p>
-      <w:pPr>
-        <w:pStyle w:val="Definition"/>
-      </w:pPr>
-      <w:r>
-        <w:t xml:space="preserve">If /pol/ maintains an</w:t>
-      </w:r>
-      <w:r>
-        <w:t xml:space="preserve"> </w:t>
-      </w:r>
-      <w:r>
-        <w:t xml:space="preserve">alternative media ecosystem, alternative outlets will be numerically</w:t>
-      </w:r>
-      <w:r>
-        <w:t xml:space="preserve"> </w:t>
-      </w:r>
-      <w:r>
-        <w:t xml:space="preserve">substantial, mutually co-cited and structurally central in the citation network.</w:t>
+        <w:t xml:space="preserve">H1 (counter-canon)</w:t>
+      </w:r>
+      <w:r>
+        <w:t xml:space="preserve"> </w:t>
+      </w:r>
+      <w:r>
+        <w:t xml:space="preserve">holds that if /pol/ maintains an alternative media</w:t>
+      </w:r>
+      <w:r>
+        <w:t xml:space="preserve"> </w:t>
+      </w:r>
+      <w:r>
+        <w:t xml:space="preserve">ecosystem, alternative outlets will be numerically substantial, mutually</w:t>
+      </w:r>
+      <w:r>
+        <w:t xml:space="preserve"> </w:t>
+      </w:r>
+      <w:r>
+        <w:t xml:space="preserve">co-cited and structurally central in the citation network.</w:t>
       </w:r>
       <w:r>
         <w:t xml:space="preserve"> </w:t>
@@ -1296,118 +1296,73 @@
       <w:r>
         <w:t xml:space="preserve">test all three implications.</w:t>
       </w:r>
-    </w:p>
-    <w:p>
-      <w:pPr>
-        <w:pStyle w:val="DefinitionTerm"/>
-      </w:pPr>
+      <w:r>
+        <w:t xml:space="preserve"> </w:t>
+      </w:r>
       <w:r>
         <w:rPr>
           <w:b/>
           <w:bCs/>
         </w:rPr>
-        <w:t xml:space="preserve">H2 (infrastructure).</w:t>
-      </w:r>
-    </w:p>
-    <w:p>
-      <w:pPr>
-        <w:pStyle w:val="Definition"/>
-      </w:pPr>
-      <w:r>
-        <w:t xml:space="preserve">If circulation is organised by</w:t>
-      </w:r>
-      <w:r>
-        <w:t xml:space="preserve"> </w:t>
-      </w:r>
-      <w:r>
-        <w:t xml:space="preserve">platform affordance and preservation need, platform and archive hosts will</w:t>
-      </w:r>
-      <w:r>
-        <w:t xml:space="preserve"> </w:t>
-      </w:r>
-      <w:r>
-        <w:t xml:space="preserve">dominate the citation supply, and co-citation communities will partition by</w:t>
-      </w:r>
-      <w:r>
-        <w:t xml:space="preserve"> </w:t>
-      </w:r>
-      <w:r>
-        <w:t xml:space="preserve">subject matter in place of editorial orientation.</w:t>
-      </w:r>
-      <w:r>
-        <w:t xml:space="preserve"> </w:t>
-      </w:r>
-      <w:r>
-        <w:t xml:space="preserve">Sections </w:t>
-      </w:r>
-      <w:hyperlink w:anchor="sec:shares">
-        <w:r>
-          <w:rPr>
-            <w:rStyle w:val="Hyperlink"/>
-          </w:rPr>
-          <w:t xml:space="preserve">4.1</w:t>
-        </w:r>
-      </w:hyperlink>
-      <w:r>
-        <w:t xml:space="preserve"> </w:t>
-      </w:r>
-      <w:r>
-        <w:t xml:space="preserve">and</w:t>
-      </w:r>
-      <w:r>
-        <w:t xml:space="preserve"> </w:t>
-      </w:r>
-      <w:hyperlink w:anchor="sec:network">
-        <w:r>
-          <w:rPr>
-            <w:rStyle w:val="Hyperlink"/>
-          </w:rPr>
-          <w:t xml:space="preserve">4.3</w:t>
-        </w:r>
-      </w:hyperlink>
-      <w:r>
-        <w:t xml:space="preserve"> </w:t>
-      </w:r>
-      <w:r>
-        <w:t xml:space="preserve">test both parts.</w:t>
-      </w:r>
-    </w:p>
-    <w:p>
-      <w:pPr>
-        <w:pStyle w:val="DefinitionTerm"/>
-      </w:pPr>
+        <w:t xml:space="preserve">H2 (infrastructure)</w:t>
+      </w:r>
+      <w:r>
+        <w:t xml:space="preserve"> </w:t>
+      </w:r>
+      <w:r>
+        <w:t xml:space="preserve">holds that if circulation is organised by platform</w:t>
+      </w:r>
+      <w:r>
+        <w:t xml:space="preserve"> </w:t>
+      </w:r>
+      <w:r>
+        <w:t xml:space="preserve">affordance and preservation need, platform and archive hosts will dominate the</w:t>
+      </w:r>
+      <w:r>
+        <w:t xml:space="preserve"> </w:t>
+      </w:r>
+      <w:r>
+        <w:t xml:space="preserve">citation supply, and co-citation communities will partition by subject matter in</w:t>
+      </w:r>
+      <w:r>
+        <w:t xml:space="preserve"> </w:t>
+      </w:r>
+      <w:r>
+        <w:t xml:space="preserve">place of editorial orientation. The same two sections test both parts.</w:t>
+      </w:r>
+      <w:r>
+        <w:t xml:space="preserve"> </w:t>
+      </w:r>
       <w:r>
         <w:rPr>
           <w:b/>
           <w:bCs/>
         </w:rPr>
-        <w:t xml:space="preserve">H3 (instrument dependence).</w:t>
-      </w:r>
-    </w:p>
-    <w:p>
-      <w:pPr>
-        <w:pStyle w:val="Definition"/>
-      </w:pPr>
-      <w:r>
-        <w:t xml:space="preserve">If source taxonomies</w:t>
-      </w:r>
-      <w:r>
-        <w:t xml:space="preserve"> </w:t>
-      </w:r>
-      <w:r>
-        <w:t xml:space="preserve">built for the American media market are applied to an internationally sourced</w:t>
-      </w:r>
-      <w:r>
-        <w:t xml:space="preserve"> </w:t>
-      </w:r>
-      <w:r>
-        <w:t xml:space="preserve">corpus, measured news share will be biased downward by an amount large enough to</w:t>
-      </w:r>
-      <w:r>
-        <w:t xml:space="preserve"> </w:t>
-      </w:r>
-      <w:r>
-        <w:t xml:space="preserve">alter substantive conclusions. Section </w:t>
+        <w:t xml:space="preserve">H3 (instrument dependence)</w:t>
+      </w:r>
+      <w:r>
+        <w:t xml:space="preserve"> </w:t>
+      </w:r>
+      <w:r>
+        <w:t xml:space="preserve">holds that if source taxonomies built for</w:t>
+      </w:r>
+      <w:r>
+        <w:t xml:space="preserve"> </w:t>
+      </w:r>
+      <w:r>
+        <w:t xml:space="preserve">the American media market are applied to an internationally sourced corpus,</w:t>
+      </w:r>
+      <w:r>
+        <w:t xml:space="preserve"> </w:t>
+      </w:r>
+      <w:r>
+        <w:t xml:space="preserve">measured news share will be biased downward by an amount large enough to alter</w:t>
+      </w:r>
+      <w:r>
+        <w:t xml:space="preserve"> </w:t>
+      </w:r>
+      <w:r>
+        <w:t xml:space="preserve">substantive conclusions, which Section </w:t>
       </w:r>
       <w:hyperlink w:anchor="sec:coding">
         <w:r>
@@ -1421,12 +1376,12 @@
         <w:t xml:space="preserve"> </w:t>
       </w:r>
       <w:r>
-        <w:t xml:space="preserve">quantifies it.</w:t>
-      </w:r>
-    </w:p>
-    <w:p>
-      <w:pPr>
-        <w:pStyle w:val="FirstParagraph"/>
+        <w:t xml:space="preserve">quantifies.</w:t>
+      </w:r>
+    </w:p>
+    <w:p>
+      <w:pPr>
+        <w:pStyle w:val="BodyText"/>
       </w:pPr>
       <w:r>
         <w:t xml:space="preserve">H1 and H2 are rivals over the same evidence, which is what makes the test</w:t>
@@ -2125,16 +2080,11 @@
         <w:t xml:space="preserve"> </w:t>
       </w:r>
       <w:r>
-        <w:t xml:space="preserve">Four rules were fixed in advance and applied uniformly:</w:t>
-      </w:r>
-    </w:p>
-    <w:p>
-      <w:pPr>
-        <w:numPr>
-          <w:ilvl w:val="0"/>
-          <w:numId w:val="1002"/>
-        </w:numPr>
-      </w:pPr>
+        <w:t xml:space="preserve">Four rules were fixed in advance and applied uniformly.</w:t>
+      </w:r>
+      <w:r>
+        <w:t xml:space="preserve"> </w:t>
+      </w:r>
       <w:r>
         <w:rPr>
           <w:b/>
@@ -2146,7 +2096,10 @@
         <w:t xml:space="preserve"> </w:t>
       </w:r>
       <w:r>
-        <w:t xml:space="preserve">(</w:t>
+        <w:t xml:space="preserve">such as</w:t>
+      </w:r>
+      <w:r>
+        <w:t xml:space="preserve"> </w:t>
       </w:r>
       <w:r>
         <w:rPr>
@@ -2155,7 +2108,10 @@
         <w:t xml:space="preserve">msn.com</w:t>
       </w:r>
       <w:r>
-        <w:t xml:space="preserve">,</w:t>
+        <w:t xml:space="preserve"> </w:t>
+      </w:r>
+      <w:r>
+        <w:t xml:space="preserve">and</w:t>
       </w:r>
       <w:r>
         <w:t xml:space="preserve"> </w:t>
@@ -2167,22 +2123,26 @@
         <w:t xml:space="preserve">yahoo.com</w:t>
       </w:r>
       <w:r>
-        <w:t xml:space="preserve">) are coded by</w:t>
-      </w:r>
-      <w:r>
-        <w:t xml:space="preserve"> </w:t>
-      </w:r>
-      <w:r>
-        <w:t xml:space="preserve">what they redistribute; search engines and link shorteners are not news.</w:t>
-      </w:r>
-    </w:p>
-    <w:p>
-      <w:pPr>
-        <w:numPr>
-          <w:ilvl w:val="0"/>
-          <w:numId w:val="1002"/>
-        </w:numPr>
-      </w:pPr>
+        <w:t xml:space="preserve"> </w:t>
+      </w:r>
+      <w:r>
+        <w:t xml:space="preserve">are coded by what they</w:t>
+      </w:r>
+      <w:r>
+        <w:t xml:space="preserve"> </w:t>
+      </w:r>
+      <w:r>
+        <w:t xml:space="preserve">redistribute, while search engines and link shorteners fall outside the news</w:t>
+      </w:r>
+      <w:r>
+        <w:t xml:space="preserve"> </w:t>
+      </w:r>
+      <w:r>
+        <w:t xml:space="preserve">categories altogether.</w:t>
+      </w:r>
+      <w:r>
+        <w:t xml:space="preserve"> </w:t>
+      </w:r>
       <w:r>
         <w:rPr>
           <w:b/>
@@ -2194,34 +2154,35 @@
         <w:t xml:space="preserve"> </w:t>
       </w:r>
       <w:r>
-        <w:t xml:space="preserve">is defined by ownership and funding, not</w:t>
-      </w:r>
-      <w:r>
-        <w:t xml:space="preserve"> </w:t>
-      </w:r>
-      <w:r>
-        <w:t xml:space="preserve">editorial independence. This groups Al Jazeera with the BBC, ABC (Australia),</w:t>
-      </w:r>
-      <w:r>
-        <w:t xml:space="preserve"> </w:t>
-      </w:r>
-      <w:r>
-        <w:t xml:space="preserve">PBS, NHK, Deutsche Welle, Anadolu, Channel News Asia and Minnesota Public Radio,</w:t>
-      </w:r>
-      <w:r>
-        <w:t xml:space="preserve"> </w:t>
-      </w:r>
-      <w:r>
-        <w:t xml:space="preserve">and moves the BBC (135 citations) out of mainstream.</w:t>
-      </w:r>
-    </w:p>
-    <w:p>
-      <w:pPr>
-        <w:numPr>
-          <w:ilvl w:val="0"/>
-          <w:numId w:val="1002"/>
-        </w:numPr>
-      </w:pPr>
+        <w:t xml:space="preserve">status takes ownership and</w:t>
+      </w:r>
+      <w:r>
+        <w:t xml:space="preserve"> </w:t>
+      </w:r>
+      <w:r>
+        <w:t xml:space="preserve">funding as its criterion, setting editorial independence aside, which groups Al</w:t>
+      </w:r>
+      <w:r>
+        <w:t xml:space="preserve"> </w:t>
+      </w:r>
+      <w:r>
+        <w:t xml:space="preserve">Jazeera with the BBC, ABC (Australia), PBS, NHK, Deutsche Welle, Anadolu,</w:t>
+      </w:r>
+      <w:r>
+        <w:t xml:space="preserve"> </w:t>
+      </w:r>
+      <w:r>
+        <w:t xml:space="preserve">Channel News Asia and Minnesota Public Radio, and moves the BBC (135 citations)</w:t>
+      </w:r>
+      <w:r>
+        <w:t xml:space="preserve"> </w:t>
+      </w:r>
+      <w:r>
+        <w:t xml:space="preserve">out of mainstream.</w:t>
+      </w:r>
+      <w:r>
+        <w:t xml:space="preserve"> </w:t>
+      </w:r>
       <w:r>
         <w:rPr>
           <w:b/>
@@ -2233,39 +2194,48 @@
         <w:t xml:space="preserve"> </w:t>
       </w:r>
       <w:r>
-        <w:t xml:space="preserve">count as alternative media.</w:t>
-      </w:r>
-    </w:p>
-    <w:p>
-      <w:pPr>
-        <w:numPr>
-          <w:ilvl w:val="0"/>
-          <w:numId w:val="1002"/>
-        </w:numPr>
-      </w:pPr>
+        <w:t xml:space="preserve">count as alternative</w:t>
+      </w:r>
+      <w:r>
+        <w:t xml:space="preserve"> </w:t>
+      </w:r>
+      <w:r>
+        <w:t xml:space="preserve">media, since they produce editorial content of their own.</w:t>
+      </w:r>
+      <w:r>
+        <w:t xml:space="preserve"> </w:t>
+      </w:r>
       <w:r>
         <w:rPr>
           <w:b/>
           <w:bCs/>
         </w:rPr>
-        <w:t xml:space="preserve">Campaign sites</w:t>
-      </w:r>
-      <w:r>
-        <w:t xml:space="preserve"> </w:t>
-      </w:r>
-      <w:r>
-        <w:t xml:space="preserve">stay unclassified; state media outlets remain</w:t>
-      </w:r>
-      <w:r>
-        <w:t xml:space="preserve"> </w:t>
-      </w:r>
-      <w:r>
-        <w:t xml:space="preserve">state-controlled.</w:t>
-      </w:r>
-    </w:p>
-    <w:p>
-      <w:pPr>
-        <w:pStyle w:val="FirstParagraph"/>
+        <w:t xml:space="preserve">Campaign</w:t>
+      </w:r>
+      <w:r>
+        <w:rPr>
+          <w:b/>
+          <w:bCs/>
+        </w:rPr>
+        <w:t xml:space="preserve"> </w:t>
+      </w:r>
+      <w:r>
+        <w:rPr>
+          <w:b/>
+          <w:bCs/>
+        </w:rPr>
+        <w:t xml:space="preserve">sites</w:t>
+      </w:r>
+      <w:r>
+        <w:t xml:space="preserve"> </w:t>
+      </w:r>
+      <w:r>
+        <w:t xml:space="preserve">remain unclassified, while state media outlets stay state-controlled.</w:t>
+      </w:r>
+    </w:p>
+    <w:p>
+      <w:pPr>
+        <w:pStyle w:val="BodyText"/>
       </w:pPr>
       <w:r>
         <w:t xml:space="preserve">Manual coding raised news media from 4.6% to</w:t>
@@ -5347,153 +5317,8 @@
       </w:pPr>
     </w:lvl>
   </w:abstractNum>
-  <w:abstractNum w:abstractNumId="99201">
-    <w:nsid w:val="00A99201"/>
-    <w:multiLevelType w:val="multilevel"/>
-    <w:lvl w:ilvl="0">
-      <w:start w:val="1"/>
-      <w:numFmt w:val="decimal"/>
-      <w:lvlText w:val="%1."/>
-      <w:lvlJc w:val="left"/>
-      <w:pPr>
-        <w:ind w:left="720" w:hanging="360"/>
-      </w:pPr>
-    </w:lvl>
-    <w:lvl w:ilvl="1">
-      <w:start w:val="1"/>
-      <w:numFmt w:val="lowerLetter"/>
-      <w:lvlText w:val="%2."/>
-      <w:lvlJc w:val="left"/>
-      <w:pPr>
-        <w:ind w:left="1440" w:hanging="360"/>
-      </w:pPr>
-    </w:lvl>
-    <w:lvl w:ilvl="2">
-      <w:start w:val="1"/>
-      <w:numFmt w:val="lowerRoman"/>
-      <w:lvlText w:val="%3."/>
-      <w:lvlJc w:val="left"/>
-      <w:pPr>
-        <w:ind w:left="2160" w:hanging="360"/>
-      </w:pPr>
-    </w:lvl>
-    <w:lvl w:ilvl="3">
-      <w:start w:val="1"/>
-      <w:numFmt w:val="decimal"/>
-      <w:lvlText w:val="%4."/>
-      <w:lvlJc w:val="left"/>
-      <w:pPr>
-        <w:ind w:left="2880" w:hanging="360"/>
-      </w:pPr>
-    </w:lvl>
-    <w:lvl w:ilvl="4">
-      <w:start w:val="1"/>
-      <w:numFmt w:val="lowerLetter"/>
-      <w:lvlText w:val="%5."/>
-      <w:lvlJc w:val="left"/>
-      <w:pPr>
-        <w:ind w:left="3600" w:hanging="360"/>
-      </w:pPr>
-    </w:lvl>
-    <w:lvl w:ilvl="5">
-      <w:start w:val="1"/>
-      <w:numFmt w:val="lowerRoman"/>
-      <w:lvlText w:val="%6."/>
-      <w:lvlJc w:val="left"/>
-      <w:pPr>
-        <w:ind w:left="4320" w:hanging="360"/>
-      </w:pPr>
-    </w:lvl>
-    <w:lvl w:ilvl="6">
-      <w:start w:val="1"/>
-      <w:numFmt w:val="decimal"/>
-      <w:lvlText w:val="%7."/>
-      <w:lvlJc w:val="left"/>
-      <w:pPr>
-        <w:ind w:left="5040" w:hanging="360"/>
-      </w:pPr>
-    </w:lvl>
-    <w:lvl w:ilvl="7">
-      <w:start w:val="1"/>
-      <w:numFmt w:val="lowerLetter"/>
-      <w:lvlText w:val="%8."/>
-      <w:lvlJc w:val="left"/>
-      <w:pPr>
-        <w:ind w:left="5760" w:hanging="360"/>
-      </w:pPr>
-    </w:lvl>
-    <w:lvl w:ilvl="8">
-      <w:start w:val="1"/>
-      <w:numFmt w:val="lowerRoman"/>
-      <w:lvlText w:val="%9."/>
-      <w:lvlJc w:val="left"/>
-      <w:pPr>
-        <w:ind w:left="6480" w:hanging="360"/>
-      </w:pPr>
-    </w:lvl>
-  </w:abstractNum>
   <w:num w:numId="1000">
     <w:abstractNumId w:val="990"/>
-  </w:num>
-  <w:num w:numId="1001">
-    <w:abstractNumId w:val="99201"/>
-    <w:lvlOverride w:ilvl="0">
-      <w:startOverride w:val="1"/>
-    </w:lvlOverride>
-    <w:lvlOverride w:ilvl="1">
-      <w:startOverride w:val="1"/>
-    </w:lvlOverride>
-    <w:lvlOverride w:ilvl="2">
-      <w:startOverride w:val="1"/>
-    </w:lvlOverride>
-    <w:lvlOverride w:ilvl="3">
-      <w:startOverride w:val="1"/>
-    </w:lvlOverride>
-    <w:lvlOverride w:ilvl="4">
-      <w:startOverride w:val="1"/>
-    </w:lvlOverride>
-    <w:lvlOverride w:ilvl="5">
-      <w:startOverride w:val="1"/>
-    </w:lvlOverride>
-    <w:lvlOverride w:ilvl="6">
-      <w:startOverride w:val="1"/>
-    </w:lvlOverride>
-    <w:lvlOverride w:ilvl="7">
-      <w:startOverride w:val="1"/>
-    </w:lvlOverride>
-    <w:lvlOverride w:ilvl="8">
-      <w:startOverride w:val="1"/>
-    </w:lvlOverride>
-  </w:num>
-  <w:num w:numId="1002">
-    <w:abstractNumId w:val="99201"/>
-    <w:lvlOverride w:ilvl="0">
-      <w:startOverride w:val="1"/>
-    </w:lvlOverride>
-    <w:lvlOverride w:ilvl="1">
-      <w:startOverride w:val="1"/>
-    </w:lvlOverride>
-    <w:lvlOverride w:ilvl="2">
-      <w:startOverride w:val="1"/>
-    </w:lvlOverride>
-    <w:lvlOverride w:ilvl="3">
-      <w:startOverride w:val="1"/>
-    </w:lvlOverride>
-    <w:lvlOverride w:ilvl="4">
-      <w:startOverride w:val="1"/>
-    </w:lvlOverride>
-    <w:lvlOverride w:ilvl="5">
-      <w:startOverride w:val="1"/>
-    </w:lvlOverride>
-    <w:lvlOverride w:ilvl="6">
-      <w:startOverride w:val="1"/>
-    </w:lvlOverride>
-    <w:lvlOverride w:ilvl="7">
-      <w:startOverride w:val="1"/>
-    </w:lvlOverride>
-    <w:lvlOverride w:ilvl="8">
-      <w:startOverride w:val="1"/>
-    </w:lvlOverride>
   </w:num>
 </w:numbering>
 </file>

</xml_diff>